<commit_message>
updated PPT, Word and PDF files
</commit_message>
<xml_diff>
--- a/04/04_gyakorlat_https_tls_tanusitvanyok.docx
+++ b/04/04_gyakorlat_https_tls_tanusitvanyok.docx
@@ -285,31 +285,6 @@
       <w:proofErr w:type="spellStart"/>
       <w:r>
         <w:t>figyelmeztetést</w:t>
-      </w:r>
-      <w:proofErr w:type="spellEnd"/>
-      <w:r>
-        <w:br/>
-        <w:t xml:space="preserve">• </w:t>
-      </w:r>
-      <w:proofErr w:type="spellStart"/>
-      <w:r>
-        <w:t>az</w:t>
-      </w:r>
-      <w:proofErr w:type="spellEnd"/>
-      <w:r>
-        <w:t xml:space="preserve"> </w:t>
-      </w:r>
-      <w:proofErr w:type="spellStart"/>
-      <w:r>
-        <w:t>automatikus</w:t>
-      </w:r>
-      <w:proofErr w:type="spellEnd"/>
-      <w:r>
-        <w:t xml:space="preserve"> HTTPS-re </w:t>
-      </w:r>
-      <w:proofErr w:type="spellStart"/>
-      <w:r>
-        <w:t>irányítást</w:t>
       </w:r>
       <w:proofErr w:type="spellEnd"/>
     </w:p>

</xml_diff>